<commit_message>
docs: update Usage_Guide.docx for category icon row, carousel arrows, and 77-store count
Adds a bullet + updated home-page screenshot for the new round category
icon strip and per-row scroll arrows, a new screenshot in 2.3 showing
newly added fictitious non-restaurant stores rendering correctly, and
corrects the seeded-store count (57 -> 77, confirmed live via the admin
dashboard) throughout, including a refreshed Restaurants-tab screenshot.

Co-Authored-By: Claude Sonnet 5 <noreply@anthropic.com>
</commit_message>
<xml_diff>
--- a/docs/Usage_Guide.docx
+++ b/docs/Usage_Guide.docx
@@ -214,6 +214,32 @@
       </w:pPr>
       <w:r>
         <w:t xml:space="preserve">Store sections such as "Popular near you" and "Quick delivery", mixing restaurants with grocery, pet, beauty, and other category stores.</w:t>
+      </w:r>
+    </w:p>
+    <w:p>
+      <w:pPr>
+        <w:pStyle w:val="ListParagraph"/>
+        <w:numPr>
+          <w:ilvl w:val="0"/>
+          <w:numId w:val="1"/>
+        </w:numPr>
+        <w:spacing w:after="80"/>
+      </w:pPr>
+      <w:r>
+        <w:t xml:space="preserve">A round category icon strip below the search bar — one tap-through icon per category (Restaurants, Grocery, Convenience, Alcohol, Health, Retail, Pet, Flowers, Baby, Personal Care, Electronics), the same idea as Uber Eats' category row — with left/right scroll arrows in place of a raw scrollbar.</w:t>
+      </w:r>
+    </w:p>
+    <w:p>
+      <w:pPr>
+        <w:pStyle w:val="ListParagraph"/>
+        <w:numPr>
+          <w:ilvl w:val="0"/>
+          <w:numId w:val="1"/>
+        </w:numPr>
+        <w:spacing w:after="80"/>
+      </w:pPr>
+      <w:r>
+        <w:t xml:space="preserve">Every horizontally-scrolling row on the page (the category icon strip and each store carousel such as "Popular near you") now shows left/right arrow buttons once there's more content to scroll to, instead of relying on a trackpad/scrollbar gesture.</w:t>
       </w:r>
     </w:p>
     <w:p>
@@ -272,7 +298,7 @@
           <w:i/>
           <w:iCs/>
         </w:rPr>
-        <w:t xml:space="preserve">Home page — sidebar categories, search, filters, and a mixed feed of restaurants and other stores</w:t>
+        <w:t xml:space="preserve">Home page — sidebar categories, search, filters, the new round category icon strip with scroll arrows, and a mixed feed of restaurants and other stores</w:t>
       </w:r>
     </w:p>
     <w:p>
@@ -363,7 +389,7 @@
         <w:spacing w:after="200"/>
       </w:pPr>
       <w:r>
-        <w:t xml:space="preserve">The same browse-and-add flow now covers ten non-restaurant categories as well — grocery, convenience, alcohol, health, retail, pet, flowers, baby, personal care, and electronics. Each category store has its own catalog page laid out the same way as a restaurant's menu.</w:t>
+        <w:t xml:space="preserve">The same browse-and-add flow now covers ten non-restaurant categories as well — grocery, convenience, alcohol, health, retail, pet, flowers, baby, personal care, and electronics. Each category store has its own catalog page laid out the same way as a restaurant's menu. Every category now carries multiple fictitious stores (2-4 per category), so the "Popular near you" and "Quick delivery" carousels on the home page mix restaurants with grocery, pet, retail, and every other category by default.</w:t>
       </w:r>
     </w:p>
     <w:p>
@@ -427,6 +453,65 @@
     </w:p>
     <w:p>
       <w:pPr>
+        <w:spacing w:after="100" w:before="100"/>
+        <w:jc w:val="center"/>
+      </w:pPr>
+      <w:r>
+        <w:drawing>
+          <wp:inline distT="0" distB="0" distL="0" distR="0">
+            <wp:extent cx="5334000" cy="3333750"/>
+            <wp:effectExtent t="0" r="0" b="0" l="0"/>
+            <wp:docPr id="1" name="" descr="" title=""/>
+            <wp:cNvGraphicFramePr>
+              <a:graphicFrameLocks xmlns:a="http://schemas.openxmlformats.org/drawingml/2006/main" noChangeAspect="1"/>
+            </wp:cNvGraphicFramePr>
+            <a:graphic xmlns:a="http://schemas.openxmlformats.org/drawingml/2006/main">
+              <a:graphicData uri="http://schemas.openxmlformats.org/drawingml/2006/picture">
+                <pic:pic xmlns:pic="http://schemas.openxmlformats.org/drawingml/2006/picture">
+                  <pic:nvPicPr>
+                    <pic:cNvPr id="0" name="" descr=""/>
+                    <pic:cNvPicPr>
+                      <a:picLocks noChangeAspect="1" noChangeArrowheads="1"/>
+                    </pic:cNvPicPr>
+                  </pic:nvPicPr>
+                  <pic:blipFill>
+                    <a:blip r:embed="rId23" cstate="none"/>
+                    <a:srcRect/>
+                    <a:stretch>
+                      <a:fillRect/>
+                    </a:stretch>
+                  </pic:blipFill>
+                  <pic:spPr bwMode="auto">
+                    <a:xfrm>
+                      <a:off x="0" y="0"/>
+                      <a:ext cx="5334000" cy="3333750"/>
+                    </a:xfrm>
+                    <a:prstGeom prst="rect">
+                      <a:avLst/>
+                    </a:prstGeom>
+                  </pic:spPr>
+                </pic:pic>
+              </a:graphicData>
+            </a:graphic>
+          </wp:inline>
+        </w:drawing>
+      </w:r>
+    </w:p>
+    <w:p>
+      <w:pPr>
+        <w:spacing w:after="300"/>
+        <w:jc w:val="center"/>
+      </w:pPr>
+      <w:r>
+        <w:rPr>
+          <w:i/>
+          <w:iCs/>
+        </w:rPr>
+        <w:t xml:space="preserve">Home-page carousel with scroll arrows, showing newly added fictitious stores (e.g. "Pantry Post", "Trend Corner") mixed in with existing ones</w:t>
+      </w:r>
+    </w:p>
+    <w:p>
+      <w:pPr>
         <w:pStyle w:val="Heading2"/>
       </w:pPr>
       <w:r>
@@ -1260,7 +1345,7 @@
         <w:spacing w:after="80"/>
       </w:pPr>
       <w:r>
-        <w:t xml:space="preserve">Restaurants tab — every store (57 in the current seed data, spanning all marketplace categories) with its open/suspended status and a Suspend action.</w:t>
+        <w:t xml:space="preserve">Restaurants tab — every store (77 in the current seed data, spanning all marketplace categories) with its open/suspended status and a Suspend action.</w:t>
       </w:r>
     </w:p>
     <w:p>
@@ -1512,7 +1597,7 @@
         <w:spacing w:after="80"/>
       </w:pPr>
       <w:r>
-        <w:t xml:space="preserve">The marketplace now spans 11 categories (restaurants plus grocery, convenience, alcohol, health, retail, pet, flowers, baby, personal care, and electronics) across 57 seeded stores — see UserList.docx for the full account list.</w:t>
+        <w:t xml:space="preserve">The marketplace now spans 11 categories (restaurants plus grocery, convenience, alcohol, health, retail, pet, flowers, baby, personal care, and electronics) across 77 seeded stores — see UserList.docx for the full account list.</w:t>
       </w:r>
     </w:p>
     <w:p>

</xml_diff>